<commit_message>
Activation request IDs without the underscore (TRING001), also as sent to CRM
- db/mssql/0025: ops.usp_NextPrefixedIdentifier issues the ticket code
  directly followed by the number (TRING001). Per-ISP counters carry on;
  IDs already issued keep their underscore. Schema version 18.
- CRM_BP_CREATE NAME is the request ID without underscore or space
  (TRING001; an older TRING_003 is sent as TRING003).
- Identifier pattern is now ^[A-Z]+_?[0-9]+$ so old IDs and the PAR_ series
  stay valid.
- Examples updated in the ISP form hint, the CRM API description, the
  integrator document, Postman collections and docs.

Co-Authored-By: Claude Opus 5.5 <noreply@anthropic.com>
Claude-Session: https://claude.ai/code/session_01XdGj2CrB1wbzi2FfX7rZzs
</commit_message>
<xml_diff>
--- a/docs/integration/Bitstream-CRM-Inbound-API.docx
+++ b/docs/integration/Bitstream-CRM-Inbound-API.docx
@@ -1891,13 +1891,13 @@
           <w:sz w:val="20"/>
           <w:szCs w:val="20"/>
         </w:rPr>
-        <w:t xml:space="preserve">TRING_001</w:t>
-      </w:r>
-      <w:r>
-        <w:rPr>
-          <w:rFonts w:ascii="Calibri" w:cs="Calibri" w:eastAsia="Calibri" w:hAnsi="Calibri"/>
-        </w:rPr>
-        <w:t xml:space="preserve"> (the ISP's code, an underscore and a number), </w:t>
+        <w:t xml:space="preserve">TRING001</w:t>
+      </w:r>
+      <w:r>
+        <w:rPr>
+          <w:rFonts w:ascii="Calibri" w:cs="Calibri" w:eastAsia="Calibri" w:hAnsi="Calibri"/>
+        </w:rPr>
+        <w:t xml:space="preserve"> (the ISP's ticket code directly followed by a number), </w:t>
       </w:r>
       <w:r>
         <w:rPr>
@@ -2066,7 +2066,7 @@
           <w:sz w:val="18"/>
           <w:szCs w:val="18"/>
         </w:rPr>
-        <w:t xml:space="preserve">  "identifier": "TRING_001",</w:t>
+        <w:t xml:space="preserve">  "identifier": "TRING001",</w:t>
       </w:r>
     </w:p>
     <w:p>
@@ -4905,7 +4905,7 @@
                 <w:sz w:val="17"/>
                 <w:szCs w:val="17"/>
               </w:rPr>
-              <w:t xml:space="preserve">TRING_001</w:t>
+              <w:t xml:space="preserve">TRING001</w:t>
             </w:r>
           </w:p>
         </w:tc>
@@ -5362,7 +5362,7 @@
           <w:sz w:val="20"/>
           <w:szCs w:val="20"/>
         </w:rPr>
-        <w:t xml:space="preserve">/api/v1/tickets/TRING_001/events</w:t>
+        <w:t xml:space="preserve">/api/v1/tickets/TRING001/events</w:t>
       </w:r>
       <w:r>
         <w:rPr>
@@ -6423,7 +6423,7 @@
           <w:sz w:val="18"/>
           <w:szCs w:val="18"/>
         </w:rPr>
-        <w:t xml:space="preserve">  "detail": "Cannot move request TRING_001 to 'AwaitingOperatorConfirmation': it is in status 'LineAvailable', which does not permit that transition (TRD 5.3)."</w:t>
+        <w:t xml:space="preserve">  "detail": "Cannot move request TRING001 to 'AwaitingOperatorConfirmation': it is in status 'LineAvailable', which does not permit that transition (TRD 5.3)."</w:t>
       </w:r>
     </w:p>
     <w:p>
@@ -7872,7 +7872,7 @@
           <w:sz w:val="20"/>
           <w:szCs w:val="20"/>
         </w:rPr>
-        <w:t xml:space="preserve">TRING_001</w:t>
+        <w:t xml:space="preserve">TRING001</w:t>
       </w:r>
       <w:r>
         <w:rPr>

</xml_diff>

<commit_message>
SALES_ORDER_OPENED: find the request by payload.salesOrderId (the portal ID)
CRM sends SALES_ORDER_OPENED on the new ticket it opens for the sales order,
a number the portal has never seen, and puts our request ID (e.g. TRING001)
in payload.salesOrderId. That now decides which request the event is for;
the new ticket number from the URL is stored as the request's SalesOrderId.
Later events may be addressed to that new ticket (lookup: portal ID, CRM
ticket, sales order ticket), and its messages appear on the request's
timeline. An event addressed to the request itself keeps the old behaviour.

API description, integrator document (docx regenerated), markdown guide and
Postman collections updated; tests for the new flow and the 404 case.

Co-Authored-By: Claude Opus 5.5 <noreply@anthropic.com>
Claude-Session: https://claude.ai/code/session_01XdGj2CrB1wbzi2FfX7rZzs
</commit_message>
<xml_diff>
--- a/docs/integration/Bitstream-CRM-Inbound-API.docx
+++ b/docs/integration/Bitstream-CRM-Inbound-API.docx
@@ -1971,13 +1971,122 @@
     </w:p>
     <w:p>
       <w:pPr>
+        <w:pStyle w:val="ListParagraph"/>
+        <w:numPr>
+          <w:ilvl w:val="0"/>
+          <w:numId w:val="2"/>
+        </w:numPr>
+        <w:spacing w:after="60"/>
+      </w:pPr>
+      <w:r>
+        <w:rPr>
+          <w:rFonts w:ascii="Calibri" w:cs="Calibri" w:eastAsia="Calibri" w:hAnsi="Calibri"/>
+        </w:rPr>
+        <w:t xml:space="preserve">after </w:t>
+      </w:r>
+      <w:r>
+        <w:rPr>
+          <w:rFonts w:ascii="Consolas" w:cs="Consolas" w:eastAsia="Consolas" w:hAnsi="Consolas"/>
+          <w:color w:val="333333"/>
+          <w:sz w:val="20"/>
+          <w:szCs w:val="20"/>
+        </w:rPr>
+        <w:t xml:space="preserve">SALES_ORDER_OPENED</w:t>
+      </w:r>
+      <w:r>
+        <w:rPr>
+          <w:rFonts w:ascii="Calibri" w:cs="Calibri" w:eastAsia="Calibri" w:hAnsi="Calibri"/>
+        </w:rPr>
+        <w:t xml:space="preserve">: the number of the new ticket CRM opened for the sales order.</w:t>
+      </w:r>
+    </w:p>
+    <w:p>
+      <w:pPr>
         <w:spacing w:after="120"/>
       </w:pPr>
       <w:r>
         <w:rPr>
           <w:rFonts w:ascii="Calibri" w:cs="Calibri" w:eastAsia="Calibri" w:hAnsi="Calibri"/>
         </w:rPr>
-        <w:t xml:space="preserve">Using the CRM ticket number is usually simplest for CRM. The portal looks for its own ID first, then for the CRM ticket number.</w:t>
+        <w:t xml:space="preserve">Using the CRM ticket number is usually simplest for CRM. The portal looks for its own ID first, then for the CRM ticket number, then for the sales order ticket.</w:t>
+      </w:r>
+    </w:p>
+    <w:p>
+      <w:pPr>
+        <w:spacing w:after="120"/>
+      </w:pPr>
+      <w:r>
+        <w:rPr>
+          <w:rFonts w:ascii="Calibri" w:cs="Calibri" w:eastAsia="Calibri" w:hAnsi="Calibri"/>
+          <w:b/>
+          <w:bCs/>
+        </w:rPr>
+        <w:t xml:space="preserve">`SALES_ORDER_OPENED` is the exception.</w:t>
+      </w:r>
+      <w:r>
+        <w:rPr>
+          <w:rFonts w:ascii="Calibri" w:cs="Calibri" w:eastAsia="Calibri" w:hAnsi="Calibri"/>
+        </w:rPr>
+        <w:t xml:space="preserve"> It is sent on the new ticket CRM opens for the sales order, which the portal does not know yet. So in this call </w:t>
+      </w:r>
+      <w:r>
+        <w:rPr>
+          <w:rFonts w:ascii="Consolas" w:cs="Consolas" w:eastAsia="Consolas" w:hAnsi="Consolas"/>
+          <w:color w:val="333333"/>
+          <w:sz w:val="20"/>
+          <w:szCs w:val="20"/>
+        </w:rPr>
+        <w:t xml:space="preserve">payload.salesOrderId</w:t>
+      </w:r>
+      <w:r>
+        <w:rPr>
+          <w:rFonts w:ascii="Calibri" w:cs="Calibri" w:eastAsia="Calibri" w:hAnsi="Calibri"/>
+        </w:rPr>
+        <w:t xml:space="preserve"> must contain the </w:t>
+      </w:r>
+      <w:r>
+        <w:rPr>
+          <w:rFonts w:ascii="Calibri" w:cs="Calibri" w:eastAsia="Calibri" w:hAnsi="Calibri"/>
+          <w:b/>
+          <w:bCs/>
+        </w:rPr>
+        <w:t xml:space="preserve">portal's request ID</w:t>
+      </w:r>
+      <w:r>
+        <w:rPr>
+          <w:rFonts w:ascii="Calibri" w:cs="Calibri" w:eastAsia="Calibri" w:hAnsi="Calibri"/>
+        </w:rPr>
+        <w:t xml:space="preserve"> (e.g. </w:t>
+      </w:r>
+      <w:r>
+        <w:rPr>
+          <w:rFonts w:ascii="Consolas" w:cs="Consolas" w:eastAsia="Consolas" w:hAnsi="Consolas"/>
+          <w:color w:val="333333"/>
+          <w:sz w:val="20"/>
+          <w:szCs w:val="20"/>
+        </w:rPr>
+        <w:t xml:space="preserve">TRING001</w:t>
+      </w:r>
+      <w:r>
+        <w:rPr>
+          <w:rFonts w:ascii="Calibri" w:cs="Calibri" w:eastAsia="Calibri" w:hAnsi="Calibri"/>
+        </w:rPr>
+        <w:t xml:space="preserve">): that is how the portal finds the request. The new ticket number in the URL is stored on the request, and later events (e.g. </w:t>
+      </w:r>
+      <w:r>
+        <w:rPr>
+          <w:rFonts w:ascii="Consolas" w:cs="Consolas" w:eastAsia="Consolas" w:hAnsi="Consolas"/>
+          <w:color w:val="333333"/>
+          <w:sz w:val="20"/>
+          <w:szCs w:val="20"/>
+        </w:rPr>
+        <w:t xml:space="preserve">LINE_ACTIVATED</w:t>
+      </w:r>
+      <w:r>
+        <w:rPr>
+          <w:rFonts w:ascii="Calibri" w:cs="Calibri" w:eastAsia="Calibri" w:hAnsi="Calibri"/>
+        </w:rPr>
+        <w:t xml:space="preserve">) may be addressed to it.</w:t>
       </w:r>
     </w:p>
     <w:p>
@@ -2117,7 +2226,7 @@
           <w:sz w:val="18"/>
           <w:szCs w:val="18"/>
         </w:rPr>
-        <w:t xml:space="preserve">  "payload": { "salesOrderId": "SO-4500123" }</w:t>
+        <w:t xml:space="preserve">  "payload": { "salesOrderId": "TRING001" }</w:t>
       </w:r>
     </w:p>
     <w:p>
@@ -3479,7 +3588,7 @@
               <w:rPr>
                 <w:rFonts w:ascii="Calibri" w:cs="Calibri" w:eastAsia="Calibri" w:hAnsi="Calibri"/>
               </w:rPr>
-              <w:t xml:space="preserve">Sales order opened</w:t>
+              <w:t xml:space="preserve">Sales order opened (new CRM ticket)</w:t>
             </w:r>
           </w:p>
         </w:tc>
@@ -3509,6 +3618,12 @@
               </w:rPr>
               <w:t xml:space="preserve">SALES_ORDER_OPENED</w:t>
             </w:r>
+            <w:r>
+              <w:rPr>
+                <w:rFonts w:ascii="Calibri" w:cs="Calibri" w:eastAsia="Calibri" w:hAnsi="Calibri"/>
+              </w:rPr>
+              <w:t xml:space="preserve">, sent to the new ticket number</w:t>
+            </w:r>
           </w:p>
         </w:tc>
         <w:tc>
@@ -3591,7 +3706,36 @@
               <w:rPr>
                 <w:rFonts w:ascii="Calibri" w:cs="Calibri" w:eastAsia="Calibri" w:hAnsi="Calibri"/>
               </w:rPr>
-              <w:t xml:space="preserve"> (required); </w:t>
+              <w:t xml:space="preserve"> (required): the </w:t>
+            </w:r>
+            <w:r>
+              <w:rPr>
+                <w:rFonts w:ascii="Calibri" w:cs="Calibri" w:eastAsia="Calibri" w:hAnsi="Calibri"/>
+                <w:b/>
+                <w:bCs/>
+              </w:rPr>
+              <w:t xml:space="preserve">portal's request ID</w:t>
+            </w:r>
+            <w:r>
+              <w:rPr>
+                <w:rFonts w:ascii="Calibri" w:cs="Calibri" w:eastAsia="Calibri" w:hAnsi="Calibri"/>
+              </w:rPr>
+              <w:t xml:space="preserve">, e.g. </w:t>
+            </w:r>
+            <w:r>
+              <w:rPr>
+                <w:rFonts w:ascii="Consolas" w:cs="Consolas" w:eastAsia="Consolas" w:hAnsi="Consolas"/>
+                <w:color w:val="333333"/>
+                <w:sz w:val="17"/>
+                <w:szCs w:val="17"/>
+              </w:rPr>
+              <w:t xml:space="preserve">TRING001</w:t>
+            </w:r>
+            <w:r>
+              <w:rPr>
+                <w:rFonts w:ascii="Calibri" w:cs="Calibri" w:eastAsia="Calibri" w:hAnsi="Calibri"/>
+              </w:rPr>
+              <w:t xml:space="preserve">; </w:t>
             </w:r>
             <w:r>
               <w:rPr>
@@ -4157,7 +4301,16 @@
               <w:rPr>
                 <w:rFonts w:ascii="Calibri" w:cs="Calibri" w:eastAsia="Calibri" w:hAnsi="Calibri"/>
               </w:rPr>
-              <w:t xml:space="preserve"> with the sales order number</w:t>
+              <w:t xml:space="preserve"> on the new sales order ticket, with the portal request ID in </w:t>
+            </w:r>
+            <w:r>
+              <w:rPr>
+                <w:rFonts w:ascii="Consolas" w:cs="Consolas" w:eastAsia="Consolas" w:hAnsi="Consolas"/>
+                <w:color w:val="333333"/>
+                <w:sz w:val="17"/>
+                <w:szCs w:val="17"/>
+              </w:rPr>
+              <w:t xml:space="preserve">salesOrderId</w:t>
             </w:r>
           </w:p>
         </w:tc>
@@ -5353,7 +5506,7 @@
         <w:rPr>
           <w:rFonts w:ascii="Calibri" w:cs="Calibri" w:eastAsia="Calibri" w:hAnsi="Calibri"/>
         </w:rPr>
-        <w:t xml:space="preserve">All examples address the request by its CRM ticket number. The same calls work with the portal ID in the URL (e.g. </w:t>
+        <w:t xml:space="preserve">Examples 6.1–6.2 address the request by its CRM ticket number (</w:t>
       </w:r>
       <w:r>
         <w:rPr>
@@ -5362,13 +5515,58 @@
           <w:sz w:val="20"/>
           <w:szCs w:val="20"/>
         </w:rPr>
+        <w:t xml:space="preserve">8009521719</w:t>
+      </w:r>
+      <w:r>
+        <w:rPr>
+          <w:rFonts w:ascii="Calibri" w:cs="Calibri" w:eastAsia="Calibri" w:hAnsi="Calibri"/>
+        </w:rPr>
+        <w:t xml:space="preserve">); the same calls work with the portal ID in the URL (e.g. </w:t>
+      </w:r>
+      <w:r>
+        <w:rPr>
+          <w:rFonts w:ascii="Consolas" w:cs="Consolas" w:eastAsia="Consolas" w:hAnsi="Consolas"/>
+          <w:color w:val="333333"/>
+          <w:sz w:val="20"/>
+          <w:szCs w:val="20"/>
+        </w:rPr>
         <w:t xml:space="preserve">/api/v1/tickets/TRING001/events</w:t>
       </w:r>
       <w:r>
         <w:rPr>
           <w:rFonts w:ascii="Calibri" w:cs="Calibri" w:eastAsia="Calibri" w:hAnsi="Calibri"/>
         </w:rPr>
-        <w:t xml:space="preserve">).</w:t>
+        <w:t xml:space="preserve">). Example 6.3 is sent on the new sales order ticket (</w:t>
+      </w:r>
+      <w:r>
+        <w:rPr>
+          <w:rFonts w:ascii="Consolas" w:cs="Consolas" w:eastAsia="Consolas" w:hAnsi="Consolas"/>
+          <w:color w:val="333333"/>
+          <w:sz w:val="20"/>
+          <w:szCs w:val="20"/>
+        </w:rPr>
+        <w:t xml:space="preserve">8009530001</w:t>
+      </w:r>
+      <w:r>
+        <w:rPr>
+          <w:rFonts w:ascii="Calibri" w:cs="Calibri" w:eastAsia="Calibri" w:hAnsi="Calibri"/>
+        </w:rPr>
+        <w:t xml:space="preserve">) with the portal request ID in </w:t>
+      </w:r>
+      <w:r>
+        <w:rPr>
+          <w:rFonts w:ascii="Consolas" w:cs="Consolas" w:eastAsia="Consolas" w:hAnsi="Consolas"/>
+          <w:color w:val="333333"/>
+          <w:sz w:val="20"/>
+          <w:szCs w:val="20"/>
+        </w:rPr>
+        <w:t xml:space="preserve">salesOrderId</w:t>
+      </w:r>
+      <w:r>
+        <w:rPr>
+          <w:rFonts w:ascii="Calibri" w:cs="Calibri" w:eastAsia="Calibri" w:hAnsi="Calibri"/>
+        </w:rPr>
+        <w:t xml:space="preserve">; 6.4 is addressed to that new ticket.</w:t>
       </w:r>
     </w:p>
     <w:p>
@@ -5755,7 +5953,7 @@
           <w:sz w:val="18"/>
           <w:szCs w:val="18"/>
         </w:rPr>
-        <w:t xml:space="preserve">POST http://10.89.4.19:9972/api/v1/tickets/8009521719/events</w:t>
+        <w:t xml:space="preserve">POST http://10.89.4.19:9972/api/v1/tickets/8009530001/events</w:t>
       </w:r>
     </w:p>
     <w:p>
@@ -5891,7 +6089,7 @@
           <w:sz w:val="18"/>
           <w:szCs w:val="18"/>
         </w:rPr>
-        <w:t xml:space="preserve">  "payload": { "salesOrderId": "SO-4500123", "businessPartner": "1102017112" }</w:t>
+        <w:t xml:space="preserve">  "payload": { "salesOrderId": "TRING001", "businessPartner": "1102017112" }</w:t>
       </w:r>
     </w:p>
     <w:p>
@@ -5935,7 +6133,7 @@
           <w:sz w:val="18"/>
           <w:szCs w:val="18"/>
         </w:rPr>
-        <w:t xml:space="preserve">POST http://10.89.4.19:9972/api/v1/tickets/8009521719/events</w:t>
+        <w:t xml:space="preserve">POST http://10.89.4.19:9972/api/v1/tickets/8009530001/events</w:t>
       </w:r>
     </w:p>
     <w:p>

</xml_diff>

<commit_message>
LINE_ACTIVATED: find the request by payload.salesOrderId too
Like SALES_ORDER_OPENED, CRM may send LINE_ACTIVATED on a ticket the portal
does not know (the sales order ticket), with our request ID (e.g. TRING001)
in payload.salesOrderId. That now finds the request; the URL identifier stays
the fallback, so calls without salesOrderId keep working. A message found
this way is linked to the request so it shows on its timeline; an unknown
request in salesOrderId on an unknown ticket is a 404 that says so.

API description, integrator document (regenerated), markdown guide and
Postman collections updated; tests for the three cases.

Co-Authored-By: Claude Opus 5.5 <noreply@anthropic.com>
Claude-Session: https://claude.ai/code/session_01XdGj2CrB1wbzi2FfX7rZzs
</commit_message>
<xml_diff>
--- a/docs/integration/Bitstream-CRM-Inbound-API.docx
+++ b/docs/integration/Bitstream-CRM-Inbound-API.docx
@@ -2021,13 +2021,13 @@
           <w:b/>
           <w:bCs/>
         </w:rPr>
-        <w:t xml:space="preserve">`SALES_ORDER_OPENED` is the exception.</w:t>
-      </w:r>
-      <w:r>
-        <w:rPr>
-          <w:rFonts w:ascii="Calibri" w:cs="Calibri" w:eastAsia="Calibri" w:hAnsi="Calibri"/>
-        </w:rPr>
-        <w:t xml:space="preserve"> It is sent on the new ticket CRM opens for the sales order, which the portal does not know yet. So in this call </w:t>
+        <w:t xml:space="preserve">`SALES_ORDER_OPENED` and `LINE_ACTIVATED` are the exception.</w:t>
+      </w:r>
+      <w:r>
+        <w:rPr>
+          <w:rFonts w:ascii="Calibri" w:cs="Calibri" w:eastAsia="Calibri" w:hAnsi="Calibri"/>
+        </w:rPr>
+        <w:t xml:space="preserve"> They are sent on the new ticket CRM opens for the sales order, which the portal may not know. So in these calls </w:t>
       </w:r>
       <w:r>
         <w:rPr>
@@ -2071,7 +2071,7 @@
         <w:rPr>
           <w:rFonts w:ascii="Calibri" w:cs="Calibri" w:eastAsia="Calibri" w:hAnsi="Calibri"/>
         </w:rPr>
-        <w:t xml:space="preserve">): that is how the portal finds the request. The new ticket number in the URL is stored on the request, and later events (e.g. </w:t>
+        <w:t xml:space="preserve">): that is how the portal finds the request. The new ticket number from </w:t>
       </w:r>
       <w:r>
         <w:rPr>
@@ -2080,13 +2080,13 @@
           <w:sz w:val="20"/>
           <w:szCs w:val="20"/>
         </w:rPr>
-        <w:t xml:space="preserve">LINE_ACTIVATED</w:t>
-      </w:r>
-      <w:r>
-        <w:rPr>
-          <w:rFonts w:ascii="Calibri" w:cs="Calibri" w:eastAsia="Calibri" w:hAnsi="Calibri"/>
-        </w:rPr>
-        <w:t xml:space="preserve">) may be addressed to it.</w:t>
+        <w:t xml:space="preserve">SALES_ORDER_OPENED</w:t>
+      </w:r>
+      <w:r>
+        <w:rPr>
+          <w:rFonts w:ascii="Calibri" w:cs="Calibri" w:eastAsia="Calibri" w:hAnsi="Calibri"/>
+        </w:rPr>
+        <w:t xml:space="preserve"> is stored on the request, so later events may also be addressed to it.</w:t>
       </w:r>
     </w:p>
     <w:p>
@@ -3805,7 +3805,7 @@
               <w:rPr>
                 <w:rFonts w:ascii="Calibri" w:cs="Calibri" w:eastAsia="Calibri" w:hAnsi="Calibri"/>
               </w:rPr>
-              <w:t xml:space="preserve">Line activated in CRM</w:t>
+              <w:t xml:space="preserve">Line activated in CRM (sales order ticket)</w:t>
             </w:r>
           </w:p>
         </w:tc>
@@ -3835,6 +3835,12 @@
               </w:rPr>
               <w:t xml:space="preserve">LINE_ACTIVATED</w:t>
             </w:r>
+            <w:r>
+              <w:rPr>
+                <w:rFonts w:ascii="Calibri" w:cs="Calibri" w:eastAsia="Calibri" w:hAnsi="Calibri"/>
+              </w:rPr>
+              <w:t xml:space="preserve">, sent to the sales order ticket</w:t>
+            </w:r>
           </w:p>
         </w:tc>
         <w:tc>
@@ -3911,7 +3917,36 @@
                 <w:sz w:val="17"/>
                 <w:szCs w:val="17"/>
               </w:rPr>
-              <w:t xml:space="preserve">{}</w:t>
+              <w:t xml:space="preserve">salesOrderId</w:t>
+            </w:r>
+            <w:r>
+              <w:rPr>
+                <w:rFonts w:ascii="Calibri" w:cs="Calibri" w:eastAsia="Calibri" w:hAnsi="Calibri"/>
+              </w:rPr>
+              <w:t xml:space="preserve"> (required): the </w:t>
+            </w:r>
+            <w:r>
+              <w:rPr>
+                <w:rFonts w:ascii="Calibri" w:cs="Calibri" w:eastAsia="Calibri" w:hAnsi="Calibri"/>
+                <w:b/>
+                <w:bCs/>
+              </w:rPr>
+              <w:t xml:space="preserve">portal's request ID</w:t>
+            </w:r>
+            <w:r>
+              <w:rPr>
+                <w:rFonts w:ascii="Calibri" w:cs="Calibri" w:eastAsia="Calibri" w:hAnsi="Calibri"/>
+              </w:rPr>
+              <w:t xml:space="preserve">, e.g. </w:t>
+            </w:r>
+            <w:r>
+              <w:rPr>
+                <w:rFonts w:ascii="Consolas" w:cs="Consolas" w:eastAsia="Consolas" w:hAnsi="Consolas"/>
+                <w:color w:val="333333"/>
+                <w:sz w:val="17"/>
+                <w:szCs w:val="17"/>
+              </w:rPr>
+              <w:t xml:space="preserve">TRING001</w:t>
             </w:r>
           </w:p>
         </w:tc>
@@ -4399,7 +4434,16 @@
               <w:rPr>
                 <w:rFonts w:ascii="Calibri" w:cs="Calibri" w:eastAsia="Calibri" w:hAnsi="Calibri"/>
               </w:rPr>
-              <w:t xml:space="preserve"> once the line is active on the CRM side</w:t>
+              <w:t xml:space="preserve"> once the line is active, with the portal request ID in </w:t>
+            </w:r>
+            <w:r>
+              <w:rPr>
+                <w:rFonts w:ascii="Consolas" w:cs="Consolas" w:eastAsia="Consolas" w:hAnsi="Consolas"/>
+                <w:color w:val="333333"/>
+                <w:sz w:val="17"/>
+                <w:szCs w:val="17"/>
+              </w:rPr>
+              <w:t xml:space="preserve">salesOrderId</w:t>
             </w:r>
           </w:p>
         </w:tc>
@@ -6269,7 +6313,7 @@
           <w:sz w:val="18"/>
           <w:szCs w:val="18"/>
         </w:rPr>
-        <w:t xml:space="preserve">  "payload": {}</w:t>
+        <w:t xml:space="preserve">  "payload": { "salesOrderId": "TRING001" }</w:t>
       </w:r>
     </w:p>
     <w:p>

</xml_diff>

<commit_message>
CRM inbound: the 200 response says whether the event was applied
A 200 alone hid that an event can be received but not applied (its
occurredAt not later than the last applied event), which looked like the
status silently not changing. The response now carries outcome
("applied" / "discarded" / "duplicate"), requestId (the matched portal
request) and, for a discarded event, detail with both times. The stored
message's response payload records the same.

API description, guide and integrator document updated; test for the three
outcomes.

Co-Authored-By: Claude Opus 5.5 <noreply@anthropic.com>
Claude-Session: https://claude.ai/code/session_01XdGj2CrB1wbzi2FfX7rZzs
</commit_message>
<xml_diff>
--- a/docs/integration/Bitstream-CRM-Inbound-API.docx
+++ b/docs/integration/Bitstream-CRM-Inbound-API.docx
@@ -6476,7 +6476,58 @@
           <w:sz w:val="18"/>
           <w:szCs w:val="18"/>
         </w:rPr>
-        <w:t xml:space="preserve">  "receivedAt": "2026-10-05T09:15:01.237+00:00"</w:t>
+        <w:t xml:space="preserve">  "receivedAt": "2026-10-05T09:15:01.237+00:00",</w:t>
+      </w:r>
+    </w:p>
+    <w:p>
+      <w:pPr>
+        <w:keepNext/>
+        <w:keepLines/>
+        <w:shd w:fill="F3F5F7" w:color="auto" w:val="clear"/>
+        <w:spacing w:after="0" w:before="0" w:line="260"/>
+        <w:ind w:left="170" w:right="170"/>
+      </w:pPr>
+      <w:r>
+        <w:rPr>
+          <w:rFonts w:ascii="Consolas" w:cs="Consolas" w:eastAsia="Consolas" w:hAnsi="Consolas"/>
+          <w:sz w:val="18"/>
+          <w:szCs w:val="18"/>
+        </w:rPr>
+        <w:t xml:space="preserve">  "outcome": "applied",</w:t>
+      </w:r>
+    </w:p>
+    <w:p>
+      <w:pPr>
+        <w:keepNext/>
+        <w:keepLines/>
+        <w:shd w:fill="F3F5F7" w:color="auto" w:val="clear"/>
+        <w:spacing w:after="0" w:before="0" w:line="260"/>
+        <w:ind w:left="170" w:right="170"/>
+      </w:pPr>
+      <w:r>
+        <w:rPr>
+          <w:rFonts w:ascii="Consolas" w:cs="Consolas" w:eastAsia="Consolas" w:hAnsi="Consolas"/>
+          <w:sz w:val="18"/>
+          <w:szCs w:val="18"/>
+        </w:rPr>
+        <w:t xml:space="preserve">  "requestId": "TRING001",</w:t>
+      </w:r>
+    </w:p>
+    <w:p>
+      <w:pPr>
+        <w:keepNext/>
+        <w:keepLines/>
+        <w:shd w:fill="F3F5F7" w:color="auto" w:val="clear"/>
+        <w:spacing w:after="0" w:before="0" w:line="260"/>
+        <w:ind w:left="170" w:right="170"/>
+      </w:pPr>
+      <w:r>
+        <w:rPr>
+          <w:rFonts w:ascii="Consolas" w:cs="Consolas" w:eastAsia="Consolas" w:hAnsi="Consolas"/>
+          <w:sz w:val="18"/>
+          <w:szCs w:val="18"/>
+        </w:rPr>
+        <w:t xml:space="preserve">  "detail": null</w:t>
       </w:r>
     </w:p>
     <w:p>
@@ -6496,6 +6547,494 @@
         <w:t xml:space="preserve">}</w:t>
       </w:r>
     </w:p>
+    <w:p>
+      <w:pPr>
+        <w:spacing w:after="120"/>
+      </w:pPr>
+      <w:r>
+        <w:rPr>
+          <w:rFonts w:ascii="Calibri" w:cs="Calibri" w:eastAsia="Calibri" w:hAnsi="Calibri"/>
+          <w:b/>
+          <w:bCs/>
+        </w:rPr>
+        <w:t xml:space="preserve">Always check `outcome`.</w:t>
+      </w:r>
+      <w:r>
+        <w:rPr>
+          <w:rFonts w:ascii="Calibri" w:cs="Calibri" w:eastAsia="Calibri" w:hAnsi="Calibri"/>
+        </w:rPr>
+        <w:t xml:space="preserve"> A 200 means the event was received, not necessarily that the request changed:</w:t>
+      </w:r>
+    </w:p>
+    <w:tbl>
+      <w:tblPr>
+        <w:tblW w:type="dxa" w:w="9638"/>
+        <w:tblBorders>
+          <w:top w:val="single" w:color="auto" w:sz="4"/>
+          <w:left w:val="single" w:color="auto" w:sz="4"/>
+          <w:bottom w:val="single" w:color="auto" w:sz="4"/>
+          <w:right w:val="single" w:color="auto" w:sz="4"/>
+          <w:insideH w:val="single" w:color="auto" w:sz="4"/>
+          <w:insideV w:val="single" w:color="auto" w:sz="4"/>
+        </w:tblBorders>
+      </w:tblPr>
+      <w:tblGrid>
+        <w:gridCol w:w="1542"/>
+        <w:gridCol w:w="5204"/>
+        <w:gridCol w:w="2892"/>
+      </w:tblGrid>
+      <w:tr>
+        <w:trPr>
+          <w:tblHeader/>
+        </w:trPr>
+        <w:tc>
+          <w:tcPr>
+            <w:tcW w:type="dxa" w:w="1542"/>
+            <w:tcBorders>
+              <w:top w:val="single" w:color="BFC7D1" w:sz="4"/>
+              <w:left w:val="single" w:color="BFC7D1" w:sz="4"/>
+              <w:bottom w:val="single" w:color="BFC7D1" w:sz="4"/>
+              <w:right w:val="single" w:color="BFC7D1" w:sz="4"/>
+            </w:tcBorders>
+            <w:shd w:fill="1F4E79" w:color="auto" w:val="clear"/>
+            <w:tcMar>
+              <w:top w:type="dxa" w:w="60"/>
+              <w:left w:type="dxa" w:w="100"/>
+              <w:bottom w:type="dxa" w:w="60"/>
+              <w:right w:type="dxa" w:w="100"/>
+            </w:tcMar>
+          </w:tcPr>
+          <w:p>
+            <w:r>
+              <w:rPr>
+                <w:rFonts w:ascii="Calibri" w:cs="Calibri" w:eastAsia="Calibri" w:hAnsi="Calibri"/>
+                <w:b/>
+                <w:bCs/>
+                <w:color w:val="FFFFFF"/>
+                <w:sz w:val="20"/>
+                <w:szCs w:val="20"/>
+              </w:rPr>
+              <w:t xml:space="preserve">outcome</w:t>
+            </w:r>
+          </w:p>
+        </w:tc>
+        <w:tc>
+          <w:tcPr>
+            <w:tcW w:type="dxa" w:w="5204"/>
+            <w:tcBorders>
+              <w:top w:val="single" w:color="BFC7D1" w:sz="4"/>
+              <w:left w:val="single" w:color="BFC7D1" w:sz="4"/>
+              <w:bottom w:val="single" w:color="BFC7D1" w:sz="4"/>
+              <w:right w:val="single" w:color="BFC7D1" w:sz="4"/>
+            </w:tcBorders>
+            <w:shd w:fill="1F4E79" w:color="auto" w:val="clear"/>
+            <w:tcMar>
+              <w:top w:type="dxa" w:w="60"/>
+              <w:left w:type="dxa" w:w="100"/>
+              <w:bottom w:type="dxa" w:w="60"/>
+              <w:right w:type="dxa" w:w="100"/>
+            </w:tcMar>
+          </w:tcPr>
+          <w:p>
+            <w:r>
+              <w:rPr>
+                <w:rFonts w:ascii="Calibri" w:cs="Calibri" w:eastAsia="Calibri" w:hAnsi="Calibri"/>
+                <w:b/>
+                <w:bCs/>
+                <w:color w:val="FFFFFF"/>
+                <w:sz w:val="20"/>
+                <w:szCs w:val="20"/>
+              </w:rPr>
+              <w:t xml:space="preserve">Meaning</w:t>
+            </w:r>
+          </w:p>
+        </w:tc>
+        <w:tc>
+          <w:tcPr>
+            <w:tcW w:type="dxa" w:w="2892"/>
+            <w:tcBorders>
+              <w:top w:val="single" w:color="BFC7D1" w:sz="4"/>
+              <w:left w:val="single" w:color="BFC7D1" w:sz="4"/>
+              <w:bottom w:val="single" w:color="BFC7D1" w:sz="4"/>
+              <w:right w:val="single" w:color="BFC7D1" w:sz="4"/>
+            </w:tcBorders>
+            <w:shd w:fill="1F4E79" w:color="auto" w:val="clear"/>
+            <w:tcMar>
+              <w:top w:type="dxa" w:w="60"/>
+              <w:left w:type="dxa" w:w="100"/>
+              <w:bottom w:type="dxa" w:w="60"/>
+              <w:right w:type="dxa" w:w="100"/>
+            </w:tcMar>
+          </w:tcPr>
+          <w:p>
+            <w:r>
+              <w:rPr>
+                <w:rFonts w:ascii="Calibri" w:cs="Calibri" w:eastAsia="Calibri" w:hAnsi="Calibri"/>
+                <w:b/>
+                <w:bCs/>
+                <w:color w:val="FFFFFF"/>
+                <w:sz w:val="20"/>
+                <w:szCs w:val="20"/>
+              </w:rPr>
+              <w:t xml:space="preserve">What to do</w:t>
+            </w:r>
+          </w:p>
+        </w:tc>
+      </w:tr>
+      <w:tr>
+        <w:trPr>
+          <w:cantSplit/>
+        </w:trPr>
+        <w:tc>
+          <w:tcPr>
+            <w:tcW w:type="dxa" w:w="1542"/>
+            <w:tcBorders>
+              <w:top w:val="single" w:color="BFC7D1" w:sz="4"/>
+              <w:left w:val="single" w:color="BFC7D1" w:sz="4"/>
+              <w:bottom w:val="single" w:color="BFC7D1" w:sz="4"/>
+              <w:right w:val="single" w:color="BFC7D1" w:sz="4"/>
+            </w:tcBorders>
+            <w:tcMar>
+              <w:top w:type="dxa" w:w="60"/>
+              <w:left w:type="dxa" w:w="100"/>
+              <w:bottom w:type="dxa" w:w="60"/>
+              <w:right w:type="dxa" w:w="100"/>
+            </w:tcMar>
+          </w:tcPr>
+          <w:p>
+            <w:r>
+              <w:rPr>
+                <w:rFonts w:ascii="Consolas" w:cs="Consolas" w:eastAsia="Consolas" w:hAnsi="Consolas"/>
+                <w:color w:val="333333"/>
+                <w:sz w:val="17"/>
+                <w:szCs w:val="17"/>
+              </w:rPr>
+              <w:t xml:space="preserve">applied</w:t>
+            </w:r>
+          </w:p>
+        </w:tc>
+        <w:tc>
+          <w:tcPr>
+            <w:tcW w:type="dxa" w:w="5204"/>
+            <w:tcBorders>
+              <w:top w:val="single" w:color="BFC7D1" w:sz="4"/>
+              <w:left w:val="single" w:color="BFC7D1" w:sz="4"/>
+              <w:bottom w:val="single" w:color="BFC7D1" w:sz="4"/>
+              <w:right w:val="single" w:color="BFC7D1" w:sz="4"/>
+            </w:tcBorders>
+            <w:tcMar>
+              <w:top w:type="dxa" w:w="60"/>
+              <w:left w:type="dxa" w:w="100"/>
+              <w:bottom w:type="dxa" w:w="60"/>
+              <w:right w:type="dxa" w:w="100"/>
+            </w:tcMar>
+          </w:tcPr>
+          <w:p>
+            <w:r>
+              <w:rPr>
+                <w:rFonts w:ascii="Calibri" w:cs="Calibri" w:eastAsia="Calibri" w:hAnsi="Calibri"/>
+              </w:rPr>
+              <w:t xml:space="preserve">The request (</w:t>
+            </w:r>
+            <w:r>
+              <w:rPr>
+                <w:rFonts w:ascii="Consolas" w:cs="Consolas" w:eastAsia="Consolas" w:hAnsi="Consolas"/>
+                <w:color w:val="333333"/>
+                <w:sz w:val="17"/>
+                <w:szCs w:val="17"/>
+              </w:rPr>
+              <w:t xml:space="preserve">requestId</w:t>
+            </w:r>
+            <w:r>
+              <w:rPr>
+                <w:rFonts w:ascii="Calibri" w:cs="Calibri" w:eastAsia="Calibri" w:hAnsi="Calibri"/>
+              </w:rPr>
+              <w:t xml:space="preserve">) moved to its next status.</w:t>
+            </w:r>
+          </w:p>
+        </w:tc>
+        <w:tc>
+          <w:tcPr>
+            <w:tcW w:type="dxa" w:w="2892"/>
+            <w:tcBorders>
+              <w:top w:val="single" w:color="BFC7D1" w:sz="4"/>
+              <w:left w:val="single" w:color="BFC7D1" w:sz="4"/>
+              <w:bottom w:val="single" w:color="BFC7D1" w:sz="4"/>
+              <w:right w:val="single" w:color="BFC7D1" w:sz="4"/>
+            </w:tcBorders>
+            <w:tcMar>
+              <w:top w:type="dxa" w:w="60"/>
+              <w:left w:type="dxa" w:w="100"/>
+              <w:bottom w:type="dxa" w:w="60"/>
+              <w:right w:type="dxa" w:w="100"/>
+            </w:tcMar>
+          </w:tcPr>
+          <w:p>
+            <w:r>
+              <w:rPr>
+                <w:rFonts w:ascii="Calibri" w:cs="Calibri" w:eastAsia="Calibri" w:hAnsi="Calibri"/>
+              </w:rPr>
+              <w:t xml:space="preserve">Nothing.</w:t>
+            </w:r>
+          </w:p>
+        </w:tc>
+      </w:tr>
+      <w:tr>
+        <w:trPr>
+          <w:cantSplit/>
+        </w:trPr>
+        <w:tc>
+          <w:tcPr>
+            <w:tcW w:type="dxa" w:w="1542"/>
+            <w:tcBorders>
+              <w:top w:val="single" w:color="BFC7D1" w:sz="4"/>
+              <w:left w:val="single" w:color="BFC7D1" w:sz="4"/>
+              <w:bottom w:val="single" w:color="BFC7D1" w:sz="4"/>
+              <w:right w:val="single" w:color="BFC7D1" w:sz="4"/>
+            </w:tcBorders>
+            <w:tcMar>
+              <w:top w:type="dxa" w:w="60"/>
+              <w:left w:type="dxa" w:w="100"/>
+              <w:bottom w:type="dxa" w:w="60"/>
+              <w:right w:type="dxa" w:w="100"/>
+            </w:tcMar>
+          </w:tcPr>
+          <w:p>
+            <w:r>
+              <w:rPr>
+                <w:rFonts w:ascii="Consolas" w:cs="Consolas" w:eastAsia="Consolas" w:hAnsi="Consolas"/>
+                <w:color w:val="333333"/>
+                <w:sz w:val="17"/>
+                <w:szCs w:val="17"/>
+              </w:rPr>
+              <w:t xml:space="preserve">discarded</w:t>
+            </w:r>
+          </w:p>
+        </w:tc>
+        <w:tc>
+          <w:tcPr>
+            <w:tcW w:type="dxa" w:w="5204"/>
+            <w:tcBorders>
+              <w:top w:val="single" w:color="BFC7D1" w:sz="4"/>
+              <w:left w:val="single" w:color="BFC7D1" w:sz="4"/>
+              <w:bottom w:val="single" w:color="BFC7D1" w:sz="4"/>
+              <w:right w:val="single" w:color="BFC7D1" w:sz="4"/>
+            </w:tcBorders>
+            <w:tcMar>
+              <w:top w:type="dxa" w:w="60"/>
+              <w:left w:type="dxa" w:w="100"/>
+              <w:bottom w:type="dxa" w:w="60"/>
+              <w:right w:type="dxa" w:w="100"/>
+            </w:tcMar>
+          </w:tcPr>
+          <w:p>
+            <w:r>
+              <w:rPr>
+                <w:rFonts w:ascii="Calibri" w:cs="Calibri" w:eastAsia="Calibri" w:hAnsi="Calibri"/>
+              </w:rPr>
+              <w:t xml:space="preserve">Received but </w:t>
+            </w:r>
+            <w:r>
+              <w:rPr>
+                <w:rFonts w:ascii="Calibri" w:cs="Calibri" w:eastAsia="Calibri" w:hAnsi="Calibri"/>
+                <w:b/>
+                <w:bCs/>
+              </w:rPr>
+              <w:t xml:space="preserve">not applied</w:t>
+            </w:r>
+            <w:r>
+              <w:rPr>
+                <w:rFonts w:ascii="Calibri" w:cs="Calibri" w:eastAsia="Calibri" w:hAnsi="Calibri"/>
+              </w:rPr>
+              <w:t xml:space="preserve">: its </w:t>
+            </w:r>
+            <w:r>
+              <w:rPr>
+                <w:rFonts w:ascii="Consolas" w:cs="Consolas" w:eastAsia="Consolas" w:hAnsi="Consolas"/>
+                <w:color w:val="333333"/>
+                <w:sz w:val="17"/>
+                <w:szCs w:val="17"/>
+              </w:rPr>
+              <w:t xml:space="preserve">occurredAt</w:t>
+            </w:r>
+            <w:r>
+              <w:rPr>
+                <w:rFonts w:ascii="Calibri" w:cs="Calibri" w:eastAsia="Calibri" w:hAnsi="Calibri"/>
+              </w:rPr>
+              <w:t xml:space="preserve"> is not later than the last event already applied to that request. </w:t>
+            </w:r>
+            <w:r>
+              <w:rPr>
+                <w:rFonts w:ascii="Consolas" w:cs="Consolas" w:eastAsia="Consolas" w:hAnsi="Consolas"/>
+                <w:color w:val="333333"/>
+                <w:sz w:val="17"/>
+                <w:szCs w:val="17"/>
+              </w:rPr>
+              <w:t xml:space="preserve">detail</w:t>
+            </w:r>
+            <w:r>
+              <w:rPr>
+                <w:rFonts w:ascii="Calibri" w:cs="Calibri" w:eastAsia="Calibri" w:hAnsi="Calibri"/>
+              </w:rPr>
+              <w:t xml:space="preserve"> gives both times.</w:t>
+            </w:r>
+          </w:p>
+        </w:tc>
+        <w:tc>
+          <w:tcPr>
+            <w:tcW w:type="dxa" w:w="2892"/>
+            <w:tcBorders>
+              <w:top w:val="single" w:color="BFC7D1" w:sz="4"/>
+              <w:left w:val="single" w:color="BFC7D1" w:sz="4"/>
+              <w:bottom w:val="single" w:color="BFC7D1" w:sz="4"/>
+              <w:right w:val="single" w:color="BFC7D1" w:sz="4"/>
+            </w:tcBorders>
+            <w:tcMar>
+              <w:top w:type="dxa" w:w="60"/>
+              <w:left w:type="dxa" w:w="100"/>
+              <w:bottom w:type="dxa" w:w="60"/>
+              <w:right w:type="dxa" w:w="100"/>
+            </w:tcMar>
+          </w:tcPr>
+          <w:p>
+            <w:r>
+              <w:rPr>
+                <w:rFonts w:ascii="Calibri" w:cs="Calibri" w:eastAsia="Calibri" w:hAnsi="Calibri"/>
+              </w:rPr>
+              <w:t xml:space="preserve">Send the event again with a new </w:t>
+            </w:r>
+            <w:r>
+              <w:rPr>
+                <w:rFonts w:ascii="Consolas" w:cs="Consolas" w:eastAsia="Consolas" w:hAnsi="Consolas"/>
+                <w:color w:val="333333"/>
+                <w:sz w:val="17"/>
+                <w:szCs w:val="17"/>
+              </w:rPr>
+              <w:t xml:space="preserve">eventId</w:t>
+            </w:r>
+            <w:r>
+              <w:rPr>
+                <w:rFonts w:ascii="Calibri" w:cs="Calibri" w:eastAsia="Calibri" w:hAnsi="Calibri"/>
+              </w:rPr>
+              <w:t xml:space="preserve"> and the real (later) </w:t>
+            </w:r>
+            <w:r>
+              <w:rPr>
+                <w:rFonts w:ascii="Consolas" w:cs="Consolas" w:eastAsia="Consolas" w:hAnsi="Consolas"/>
+                <w:color w:val="333333"/>
+                <w:sz w:val="17"/>
+                <w:szCs w:val="17"/>
+              </w:rPr>
+              <w:t xml:space="preserve">occurredAt</w:t>
+            </w:r>
+            <w:r>
+              <w:rPr>
+                <w:rFonts w:ascii="Calibri" w:cs="Calibri" w:eastAsia="Calibri" w:hAnsi="Calibri"/>
+              </w:rPr>
+              <w:t xml:space="preserve">.</w:t>
+            </w:r>
+          </w:p>
+        </w:tc>
+      </w:tr>
+      <w:tr>
+        <w:trPr>
+          <w:cantSplit/>
+        </w:trPr>
+        <w:tc>
+          <w:tcPr>
+            <w:tcW w:type="dxa" w:w="1542"/>
+            <w:tcBorders>
+              <w:top w:val="single" w:color="BFC7D1" w:sz="4"/>
+              <w:left w:val="single" w:color="BFC7D1" w:sz="4"/>
+              <w:bottom w:val="single" w:color="BFC7D1" w:sz="4"/>
+              <w:right w:val="single" w:color="BFC7D1" w:sz="4"/>
+            </w:tcBorders>
+            <w:tcMar>
+              <w:top w:type="dxa" w:w="60"/>
+              <w:left w:type="dxa" w:w="100"/>
+              <w:bottom w:type="dxa" w:w="60"/>
+              <w:right w:type="dxa" w:w="100"/>
+            </w:tcMar>
+          </w:tcPr>
+          <w:p>
+            <w:r>
+              <w:rPr>
+                <w:rFonts w:ascii="Consolas" w:cs="Consolas" w:eastAsia="Consolas" w:hAnsi="Consolas"/>
+                <w:color w:val="333333"/>
+                <w:sz w:val="17"/>
+                <w:szCs w:val="17"/>
+              </w:rPr>
+              <w:t xml:space="preserve">duplicate</w:t>
+            </w:r>
+          </w:p>
+        </w:tc>
+        <w:tc>
+          <w:tcPr>
+            <w:tcW w:type="dxa" w:w="5204"/>
+            <w:tcBorders>
+              <w:top w:val="single" w:color="BFC7D1" w:sz="4"/>
+              <w:left w:val="single" w:color="BFC7D1" w:sz="4"/>
+              <w:bottom w:val="single" w:color="BFC7D1" w:sz="4"/>
+              <w:right w:val="single" w:color="BFC7D1" w:sz="4"/>
+            </w:tcBorders>
+            <w:tcMar>
+              <w:top w:type="dxa" w:w="60"/>
+              <w:left w:type="dxa" w:w="100"/>
+              <w:bottom w:type="dxa" w:w="60"/>
+              <w:right w:type="dxa" w:w="100"/>
+            </w:tcMar>
+          </w:tcPr>
+          <w:p>
+            <w:r>
+              <w:rPr>
+                <w:rFonts w:ascii="Calibri" w:cs="Calibri" w:eastAsia="Calibri" w:hAnsi="Calibri"/>
+              </w:rPr>
+              <w:t xml:space="preserve">This </w:t>
+            </w:r>
+            <w:r>
+              <w:rPr>
+                <w:rFonts w:ascii="Consolas" w:cs="Consolas" w:eastAsia="Consolas" w:hAnsi="Consolas"/>
+                <w:color w:val="333333"/>
+                <w:sz w:val="17"/>
+                <w:szCs w:val="17"/>
+              </w:rPr>
+              <w:t xml:space="preserve">eventId</w:t>
+            </w:r>
+            <w:r>
+              <w:rPr>
+                <w:rFonts w:ascii="Calibri" w:cs="Calibri" w:eastAsia="Calibri" w:hAnsi="Calibri"/>
+              </w:rPr>
+              <w:t xml:space="preserve"> was already received; nothing was applied again.</w:t>
+            </w:r>
+          </w:p>
+        </w:tc>
+        <w:tc>
+          <w:tcPr>
+            <w:tcW w:type="dxa" w:w="2892"/>
+            <w:tcBorders>
+              <w:top w:val="single" w:color="BFC7D1" w:sz="4"/>
+              <w:left w:val="single" w:color="BFC7D1" w:sz="4"/>
+              <w:bottom w:val="single" w:color="BFC7D1" w:sz="4"/>
+              <w:right w:val="single" w:color="BFC7D1" w:sz="4"/>
+            </w:tcBorders>
+            <w:tcMar>
+              <w:top w:type="dxa" w:w="60"/>
+              <w:left w:type="dxa" w:w="100"/>
+              <w:bottom w:type="dxa" w:w="60"/>
+              <w:right w:type="dxa" w:w="100"/>
+            </w:tcMar>
+          </w:tcPr>
+          <w:p>
+            <w:r>
+              <w:rPr>
+                <w:rFonts w:ascii="Calibri" w:cs="Calibri" w:eastAsia="Calibri" w:hAnsi="Calibri"/>
+              </w:rPr>
+              <w:t xml:space="preserve">Nothing.</w:t>
+            </w:r>
+          </w:p>
+        </w:tc>
+      </w:tr>
+    </w:tbl>
     <w:p>
       <w:pPr>
         <w:pStyle w:val="Heading2"/>
@@ -6860,7 +7399,7 @@
               <w:rPr>
                 <w:rFonts w:ascii="Calibri" w:cs="Calibri" w:eastAsia="Calibri" w:hAnsi="Calibri"/>
               </w:rPr>
-              <w:t xml:space="preserve">Accepted. Also returned for a repeated </w:t>
+              <w:t xml:space="preserve">Received. Check </w:t>
             </w:r>
             <w:r>
               <w:rPr>
@@ -6869,13 +7408,13 @@
                 <w:sz w:val="17"/>
                 <w:szCs w:val="17"/>
               </w:rPr>
-              <w:t xml:space="preserve">eventId</w:t>
-            </w:r>
-            <w:r>
-              <w:rPr>
-                <w:rFonts w:ascii="Calibri" w:cs="Calibri" w:eastAsia="Calibri" w:hAnsi="Calibri"/>
-              </w:rPr>
-              <w:t xml:space="preserve"> (</w:t>
+              <w:t xml:space="preserve">outcome</w:t>
+            </w:r>
+            <w:r>
+              <w:rPr>
+                <w:rFonts w:ascii="Calibri" w:cs="Calibri" w:eastAsia="Calibri" w:hAnsi="Calibri"/>
+              </w:rPr>
+              <w:t xml:space="preserve">: </w:t>
             </w:r>
             <w:r>
               <w:rPr>
@@ -6884,13 +7423,58 @@
                 <w:sz w:val="17"/>
                 <w:szCs w:val="17"/>
               </w:rPr>
-              <w:t xml:space="preserve">"duplicate": true</w:t>
-            </w:r>
-            <w:r>
-              <w:rPr>
-                <w:rFonts w:ascii="Calibri" w:cs="Calibri" w:eastAsia="Calibri" w:hAnsi="Calibri"/>
-              </w:rPr>
-              <w:t xml:space="preserve">) and for an event older than one already applied.</w:t>
+              <w:t xml:space="preserve">applied</w:t>
+            </w:r>
+            <w:r>
+              <w:rPr>
+                <w:rFonts w:ascii="Calibri" w:cs="Calibri" w:eastAsia="Calibri" w:hAnsi="Calibri"/>
+              </w:rPr>
+              <w:t xml:space="preserve">, </w:t>
+            </w:r>
+            <w:r>
+              <w:rPr>
+                <w:rFonts w:ascii="Consolas" w:cs="Consolas" w:eastAsia="Consolas" w:hAnsi="Consolas"/>
+                <w:color w:val="333333"/>
+                <w:sz w:val="17"/>
+                <w:szCs w:val="17"/>
+              </w:rPr>
+              <w:t xml:space="preserve">discarded</w:t>
+            </w:r>
+            <w:r>
+              <w:rPr>
+                <w:rFonts w:ascii="Calibri" w:cs="Calibri" w:eastAsia="Calibri" w:hAnsi="Calibri"/>
+              </w:rPr>
+              <w:t xml:space="preserve"> (older than an event already applied — see </w:t>
+            </w:r>
+            <w:r>
+              <w:rPr>
+                <w:rFonts w:ascii="Consolas" w:cs="Consolas" w:eastAsia="Consolas" w:hAnsi="Consolas"/>
+                <w:color w:val="333333"/>
+                <w:sz w:val="17"/>
+                <w:szCs w:val="17"/>
+              </w:rPr>
+              <w:t xml:space="preserve">detail</w:t>
+            </w:r>
+            <w:r>
+              <w:rPr>
+                <w:rFonts w:ascii="Calibri" w:cs="Calibri" w:eastAsia="Calibri" w:hAnsi="Calibri"/>
+              </w:rPr>
+              <w:t xml:space="preserve">) or </w:t>
+            </w:r>
+            <w:r>
+              <w:rPr>
+                <w:rFonts w:ascii="Consolas" w:cs="Consolas" w:eastAsia="Consolas" w:hAnsi="Consolas"/>
+                <w:color w:val="333333"/>
+                <w:sz w:val="17"/>
+                <w:szCs w:val="17"/>
+              </w:rPr>
+              <w:t xml:space="preserve">duplicate</w:t>
+            </w:r>
+            <w:r>
+              <w:rPr>
+                <w:rFonts w:ascii="Calibri" w:cs="Calibri" w:eastAsia="Calibri" w:hAnsi="Calibri"/>
+              </w:rPr>
+              <w:t xml:space="preserve">.</w:t>
             </w:r>
           </w:p>
         </w:tc>
@@ -6915,7 +7499,52 @@
               <w:rPr>
                 <w:rFonts w:ascii="Calibri" w:cs="Calibri" w:eastAsia="Calibri" w:hAnsi="Calibri"/>
               </w:rPr>
-              <w:t xml:space="preserve">Nothing.</w:t>
+              <w:t xml:space="preserve">If </w:t>
+            </w:r>
+            <w:r>
+              <w:rPr>
+                <w:rFonts w:ascii="Consolas" w:cs="Consolas" w:eastAsia="Consolas" w:hAnsi="Consolas"/>
+                <w:color w:val="333333"/>
+                <w:sz w:val="17"/>
+                <w:szCs w:val="17"/>
+              </w:rPr>
+              <w:t xml:space="preserve">discarded</w:t>
+            </w:r>
+            <w:r>
+              <w:rPr>
+                <w:rFonts w:ascii="Calibri" w:cs="Calibri" w:eastAsia="Calibri" w:hAnsi="Calibri"/>
+              </w:rPr>
+              <w:t xml:space="preserve">: resend with a new </w:t>
+            </w:r>
+            <w:r>
+              <w:rPr>
+                <w:rFonts w:ascii="Consolas" w:cs="Consolas" w:eastAsia="Consolas" w:hAnsi="Consolas"/>
+                <w:color w:val="333333"/>
+                <w:sz w:val="17"/>
+                <w:szCs w:val="17"/>
+              </w:rPr>
+              <w:t xml:space="preserve">eventId</w:t>
+            </w:r>
+            <w:r>
+              <w:rPr>
+                <w:rFonts w:ascii="Calibri" w:cs="Calibri" w:eastAsia="Calibri" w:hAnsi="Calibri"/>
+              </w:rPr>
+              <w:t xml:space="preserve"> and the correct </w:t>
+            </w:r>
+            <w:r>
+              <w:rPr>
+                <w:rFonts w:ascii="Consolas" w:cs="Consolas" w:eastAsia="Consolas" w:hAnsi="Consolas"/>
+                <w:color w:val="333333"/>
+                <w:sz w:val="17"/>
+                <w:szCs w:val="17"/>
+              </w:rPr>
+              <w:t xml:space="preserve">occurredAt</w:t>
+            </w:r>
+            <w:r>
+              <w:rPr>
+                <w:rFonts w:ascii="Calibri" w:cs="Calibri" w:eastAsia="Calibri" w:hAnsi="Calibri"/>
+              </w:rPr>
+              <w:t xml:space="preserve">.</w:t>
             </w:r>
           </w:p>
         </w:tc>

</xml_diff>

<commit_message>
Rename status label 'Awaiting GIS Verification' to 'Waiting GIS Verification'
Display text only; the AwaitingGisVerification status code is unchanged.

Co-Authored-By: Claude Opus 5.5 <noreply@anthropic.com>
Claude-Session: https://claude.ai/code/session_01XdGj2CrB1wbzi2FfX7rZzs
</commit_message>
<xml_diff>
--- a/docs/integration/Bitstream-CRM-Inbound-API.docx
+++ b/docs/integration/Bitstream-CRM-Inbound-API.docx
@@ -2982,7 +2982,7 @@
         <w:rPr>
           <w:rFonts w:ascii="Calibri" w:cs="Calibri" w:eastAsia="Calibri" w:hAnsi="Calibri"/>
         </w:rPr>
-        <w:t xml:space="preserve"> in status Awaiting GIS Verification. From there CRM reports these steps, </w:t>
+        <w:t xml:space="preserve"> in status Waiting GIS Verification. From there CRM reports these steps, </w:t>
       </w:r>
       <w:r>
         <w:rPr>
@@ -3313,7 +3313,7 @@
               <w:rPr>
                 <w:rFonts w:ascii="Calibri" w:cs="Calibri" w:eastAsia="Calibri" w:hAnsi="Calibri"/>
               </w:rPr>
-              <w:t xml:space="preserve">Awaiting GIS Verification</w:t>
+              <w:t xml:space="preserve">Waiting GIS Verification</w:t>
             </w:r>
           </w:p>
         </w:tc>
@@ -3474,7 +3474,7 @@
               <w:rPr>
                 <w:rFonts w:ascii="Calibri" w:cs="Calibri" w:eastAsia="Calibri" w:hAnsi="Calibri"/>
               </w:rPr>
-              <w:t xml:space="preserve">Awaiting GIS Verification</w:t>
+              <w:t xml:space="preserve">Waiting GIS Verification</w:t>
             </w:r>
           </w:p>
         </w:tc>
@@ -4168,7 +4168,7 @@
               <w:rPr>
                 <w:rFonts w:ascii="Calibri" w:cs="Calibri" w:eastAsia="Calibri" w:hAnsi="Calibri"/>
               </w:rPr>
-              <w:t xml:space="preserve">Awaiting GIS Verification</w:t>
+              <w:t xml:space="preserve">Waiting GIS Verification</w:t>
             </w:r>
           </w:p>
         </w:tc>

</xml_diff>